<commit_message>
Add Excel data review section
</commit_message>
<xml_diff>
--- a/outputs/informe_servicio_maxilofacial.docx
+++ b/outputs/informe_servicio_maxilofacial.docx
@@ -473,6 +473,581 @@
       </w:pPr>
       <w:r>
         <w:t>Los identificadores de paciente se usaron solo para control interno de duplicados y no se incluyen en este informe.</w:t>
+      </w:r>
+    </w:p>
+    <w:p>
+      <w:pPr>
+        <w:pStyle w:val="Heading1"/>
+      </w:pPr>
+      <w:r>
+        <w:t>Datos del Excel original que conviene revisar</w:t>
+      </w:r>
+    </w:p>
+    <w:p>
+      <w:r>
+        <w:t>Esta es la revisión de mayor rendimiento antes de repetir o ampliar el análisis. No implica rehacer todo el Excel, sino corregir las columnas que más limitan la interpretación clínica.</w:t>
+      </w:r>
+    </w:p>
+    <w:tbl>
+      <w:tblPr>
+        <w:tblStyle w:val="TableGrid"/>
+        <w:tblW w:type="auto" w:w="0"/>
+        <w:jc w:val="center"/>
+        <w:tblLook w:firstColumn="1" w:firstRow="1" w:lastColumn="0" w:lastRow="0" w:noHBand="0" w:noVBand="1" w:val="04A0"/>
+      </w:tblPr>
+      <w:tblGrid>
+        <w:gridCol w:w="3400"/>
+        <w:gridCol w:w="3400"/>
+        <w:gridCol w:w="3400"/>
+      </w:tblGrid>
+      <w:tr>
+        <w:tc>
+          <w:tcPr>
+            <w:tcW w:type="dxa" w:w="2721"/>
+            <w:vAlign w:val="center"/>
+            <w:shd w:fill="0F766E"/>
+          </w:tcPr>
+          <w:p>
+            <w:pPr>
+              <w:jc w:val="left"/>
+            </w:pPr>
+            <w:r/>
+            <w:r>
+              <w:rPr>
+                <w:b/>
+                <w:color w:val="FFFFFF"/>
+                <w:sz w:val="17"/>
+              </w:rPr>
+              <w:t>Campo del Excel</w:t>
+            </w:r>
+          </w:p>
+        </w:tc>
+        <w:tc>
+          <w:tcPr>
+            <w:tcW w:type="dxa" w:w="3175"/>
+            <w:vAlign w:val="center"/>
+            <w:shd w:fill="0F766E"/>
+          </w:tcPr>
+          <w:p>
+            <w:pPr>
+              <w:jc w:val="left"/>
+            </w:pPr>
+            <w:r/>
+            <w:r>
+              <w:rPr>
+                <w:b/>
+                <w:color w:val="FFFFFF"/>
+                <w:sz w:val="17"/>
+              </w:rPr>
+              <w:t>Qué revisar</w:t>
+            </w:r>
+          </w:p>
+        </w:tc>
+        <w:tc>
+          <w:tcPr>
+            <w:tcW w:type="dxa" w:w="3175"/>
+            <w:vAlign w:val="center"/>
+            <w:shd w:fill="0F766E"/>
+          </w:tcPr>
+          <w:p>
+            <w:pPr>
+              <w:jc w:val="left"/>
+            </w:pPr>
+            <w:r/>
+            <w:r>
+              <w:rPr>
+                <w:b/>
+                <w:color w:val="FFFFFF"/>
+                <w:sz w:val="17"/>
+              </w:rPr>
+              <w:t>Qué valor aportaría</w:t>
+            </w:r>
+          </w:p>
+        </w:tc>
+      </w:tr>
+      <w:tr>
+        <w:tc>
+          <w:tcPr>
+            <w:tcW w:type="dxa" w:w="2721"/>
+            <w:vAlign w:val="center"/>
+          </w:tcPr>
+          <w:p>
+            <w:pPr>
+              <w:jc w:val="left"/>
+            </w:pPr>
+            <w:r/>
+            <w:r>
+              <w:rPr>
+                <w:b w:val="0"/>
+                <w:sz w:val="17"/>
+              </w:rPr>
+              <w:t>Recidiva (Sí/No)</w:t>
+            </w:r>
+          </w:p>
+        </w:tc>
+        <w:tc>
+          <w:tcPr>
+            <w:tcW w:type="dxa" w:w="3175"/>
+            <w:vAlign w:val="center"/>
+          </w:tcPr>
+          <w:p>
+            <w:pPr>
+              <w:jc w:val="left"/>
+            </w:pPr>
+            <w:r/>
+            <w:r>
+              <w:rPr>
+                <w:b w:val="0"/>
+                <w:sz w:val="17"/>
+              </w:rPr>
+              <w:t>Sustituir cada ? por Sí, No o Desconocido, usando un criterio clínico único.</w:t>
+            </w:r>
+          </w:p>
+        </w:tc>
+        <w:tc>
+          <w:tcPr>
+            <w:tcW w:type="dxa" w:w="3175"/>
+            <w:vAlign w:val="center"/>
+          </w:tcPr>
+          <w:p>
+            <w:pPr>
+              <w:jc w:val="left"/>
+            </w:pPr>
+            <w:r/>
+            <w:r>
+              <w:rPr>
+                <w:b w:val="0"/>
+                <w:sz w:val="17"/>
+              </w:rPr>
+              <w:t>Permitirá estimar tasa de recidiva y comparar recidiva por abordaje con denominadores claros.</w:t>
+            </w:r>
+          </w:p>
+        </w:tc>
+      </w:tr>
+      <w:tr>
+        <w:tc>
+          <w:tcPr>
+            <w:tcW w:type="dxa" w:w="2721"/>
+            <w:vAlign w:val="center"/>
+          </w:tcPr>
+          <w:p>
+            <w:pPr>
+              <w:jc w:val="left"/>
+            </w:pPr>
+            <w:r/>
+            <w:r>
+              <w:rPr>
+                <w:b w:val="0"/>
+                <w:sz w:val="17"/>
+              </w:rPr>
+              <w:t>Tiempo Recidiva (meses)</w:t>
+            </w:r>
+          </w:p>
+        </w:tc>
+        <w:tc>
+          <w:tcPr>
+            <w:tcW w:type="dxa" w:w="3175"/>
+            <w:vAlign w:val="center"/>
+          </w:tcPr>
+          <w:p>
+            <w:pPr>
+              <w:jc w:val="left"/>
+            </w:pPr>
+            <w:r/>
+            <w:r>
+              <w:rPr>
+                <w:b w:val="0"/>
+                <w:sz w:val="17"/>
+              </w:rPr>
+              <w:t>Dejar valores numéricos solo en pacientes con recidiva confirmada; en no recidiva, registrar seguimiento/censura en una columna separada.</w:t>
+            </w:r>
+          </w:p>
+        </w:tc>
+        <w:tc>
+          <w:tcPr>
+            <w:tcW w:type="dxa" w:w="3175"/>
+            <w:vAlign w:val="center"/>
+          </w:tcPr>
+          <w:p>
+            <w:pPr>
+              <w:jc w:val="left"/>
+            </w:pPr>
+            <w:r/>
+            <w:r>
+              <w:rPr>
+                <w:b w:val="0"/>
+                <w:sz w:val="17"/>
+              </w:rPr>
+              <w:t>Permitirá analizar tiempo hasta recidiva o, al menos, describir seguimiento mínimo de forma interpretable.</w:t>
+            </w:r>
+          </w:p>
+        </w:tc>
+      </w:tr>
+      <w:tr>
+        <w:tc>
+          <w:tcPr>
+            <w:tcW w:type="dxa" w:w="2721"/>
+            <w:vAlign w:val="center"/>
+          </w:tcPr>
+          <w:p>
+            <w:pPr>
+              <w:jc w:val="left"/>
+            </w:pPr>
+            <w:r/>
+            <w:r>
+              <w:rPr>
+                <w:b w:val="0"/>
+                <w:sz w:val="17"/>
+              </w:rPr>
+              <w:t>Oclusión (Normal: 1/Alterada:0)</w:t>
+            </w:r>
+          </w:p>
+        </w:tc>
+        <w:tc>
+          <w:tcPr>
+            <w:tcW w:type="dxa" w:w="3175"/>
+            <w:vAlign w:val="center"/>
+          </w:tcPr>
+          <w:p>
+            <w:pPr>
+              <w:jc w:val="left"/>
+            </w:pPr>
+            <w:r/>
+            <w:r>
+              <w:rPr>
+                <w:b w:val="0"/>
+                <w:sz w:val="17"/>
+              </w:rPr>
+              <w:t>Confirmar si 0 significa normal, alterada o ausencia de alteración. Ahora la columna es constante y no se puede contrastar.</w:t>
+            </w:r>
+          </w:p>
+        </w:tc>
+        <w:tc>
+          <w:tcPr>
+            <w:tcW w:type="dxa" w:w="3175"/>
+            <w:vAlign w:val="center"/>
+          </w:tcPr>
+          <w:p>
+            <w:pPr>
+              <w:jc w:val="left"/>
+            </w:pPr>
+            <w:r/>
+            <w:r>
+              <w:rPr>
+                <w:b w:val="0"/>
+                <w:sz w:val="17"/>
+              </w:rPr>
+              <w:t>Evitará una conclusión errónea sobre oclusión y permitirá evaluar si hubo diferencias entre abordajes.</w:t>
+            </w:r>
+          </w:p>
+        </w:tc>
+      </w:tr>
+      <w:tr>
+        <w:tc>
+          <w:tcPr>
+            <w:tcW w:type="dxa" w:w="2721"/>
+            <w:vAlign w:val="center"/>
+          </w:tcPr>
+          <w:p>
+            <w:pPr>
+              <w:jc w:val="left"/>
+            </w:pPr>
+            <w:r/>
+            <w:r>
+              <w:rPr>
+                <w:b w:val="0"/>
+                <w:sz w:val="17"/>
+              </w:rPr>
+              <w:t>Resultado Estético (1-10)</w:t>
+            </w:r>
+          </w:p>
+        </w:tc>
+        <w:tc>
+          <w:tcPr>
+            <w:tcW w:type="dxa" w:w="3175"/>
+            <w:vAlign w:val="center"/>
+          </w:tcPr>
+          <w:p>
+            <w:pPr>
+              <w:jc w:val="left"/>
+            </w:pPr>
+            <w:r/>
+            <w:r>
+              <w:rPr>
+                <w:b w:val="0"/>
+                <w:sz w:val="17"/>
+              </w:rPr>
+              <w:t>Distinguir no aplica de dato perdido; definir cuándo aplica y quién lo valoró.</w:t>
+            </w:r>
+          </w:p>
+        </w:tc>
+        <w:tc>
+          <w:tcPr>
+            <w:tcW w:type="dxa" w:w="3175"/>
+            <w:vAlign w:val="center"/>
+          </w:tcPr>
+          <w:p>
+            <w:pPr>
+              <w:jc w:val="left"/>
+            </w:pPr>
+            <w:r/>
+            <w:r>
+              <w:rPr>
+                <w:b w:val="0"/>
+                <w:sz w:val="17"/>
+              </w:rPr>
+              <w:t>Permitirá comparar resultado estético solo en pacientes evaluables y con denominador honesto.</w:t>
+            </w:r>
+          </w:p>
+        </w:tc>
+      </w:tr>
+      <w:tr>
+        <w:tc>
+          <w:tcPr>
+            <w:tcW w:type="dxa" w:w="2721"/>
+            <w:vAlign w:val="center"/>
+          </w:tcPr>
+          <w:p>
+            <w:pPr>
+              <w:jc w:val="left"/>
+            </w:pPr>
+            <w:r/>
+            <w:r>
+              <w:rPr>
+                <w:b w:val="0"/>
+                <w:sz w:val="17"/>
+              </w:rPr>
+              <w:t>Complicaciones: SI: 1 /NO: 0)</w:t>
+            </w:r>
+          </w:p>
+        </w:tc>
+        <w:tc>
+          <w:tcPr>
+            <w:tcW w:type="dxa" w:w="3175"/>
+            <w:vAlign w:val="center"/>
+          </w:tcPr>
+          <w:p>
+            <w:pPr>
+              <w:jc w:val="left"/>
+            </w:pPr>
+            <w:r/>
+            <w:r>
+              <w:rPr>
+                <w:b w:val="0"/>
+                <w:sz w:val="17"/>
+              </w:rPr>
+              <w:t>Resolver el registro ausente y confirmar que 1/0 significan siempre sí/no.</w:t>
+            </w:r>
+          </w:p>
+        </w:tc>
+        <w:tc>
+          <w:tcPr>
+            <w:tcW w:type="dxa" w:w="3175"/>
+            <w:vAlign w:val="center"/>
+          </w:tcPr>
+          <w:p>
+            <w:pPr>
+              <w:jc w:val="left"/>
+            </w:pPr>
+            <w:r/>
+            <w:r>
+              <w:rPr>
+                <w:b w:val="0"/>
+                <w:sz w:val="17"/>
+              </w:rPr>
+              <w:t>Mejorará la comparación de seguridad y evitará excluir registros innecesariamente.</w:t>
+            </w:r>
+          </w:p>
+        </w:tc>
+      </w:tr>
+      <w:tr>
+        <w:tc>
+          <w:tcPr>
+            <w:tcW w:type="dxa" w:w="2721"/>
+            <w:vAlign w:val="center"/>
+          </w:tcPr>
+          <w:p>
+            <w:pPr>
+              <w:jc w:val="left"/>
+            </w:pPr>
+            <w:r/>
+            <w:r>
+              <w:rPr>
+                <w:b w:val="0"/>
+                <w:sz w:val="17"/>
+              </w:rPr>
+              <w:t>TIPO DE COMPLICACIÓN</w:t>
+            </w:r>
+          </w:p>
+        </w:tc>
+        <w:tc>
+          <w:tcPr>
+            <w:tcW w:type="dxa" w:w="3175"/>
+            <w:vAlign w:val="center"/>
+          </w:tcPr>
+          <w:p>
+            <w:pPr>
+              <w:jc w:val="left"/>
+            </w:pPr>
+            <w:r/>
+            <w:r>
+              <w:rPr>
+                <w:b w:val="0"/>
+                <w:sz w:val="17"/>
+              </w:rPr>
+              <w:t>Separar explícitamente sin complicación de dato no registrado y normalizar categorías: parálisis, hematoma, dehiscencia, infección, otras.</w:t>
+            </w:r>
+          </w:p>
+        </w:tc>
+        <w:tc>
+          <w:tcPr>
+            <w:tcW w:type="dxa" w:w="3175"/>
+            <w:vAlign w:val="center"/>
+          </w:tcPr>
+          <w:p>
+            <w:pPr>
+              <w:jc w:val="left"/>
+            </w:pPr>
+            <w:r/>
+            <w:r>
+              <w:rPr>
+                <w:b w:val="0"/>
+                <w:sz w:val="17"/>
+              </w:rPr>
+              <w:t>Permitirá resumir el perfil de complicaciones por abordaje y no solo la variable binaria.</w:t>
+            </w:r>
+          </w:p>
+        </w:tc>
+      </w:tr>
+      <w:tr>
+        <w:tc>
+          <w:tcPr>
+            <w:tcW w:type="dxa" w:w="2721"/>
+            <w:vAlign w:val="center"/>
+          </w:tcPr>
+          <w:p>
+            <w:pPr>
+              <w:jc w:val="left"/>
+            </w:pPr>
+            <w:r/>
+            <w:r>
+              <w:rPr>
+                <w:b w:val="0"/>
+                <w:sz w:val="17"/>
+              </w:rPr>
+              <w:t>Necesidad de ortognática posteriormente</w:t>
+            </w:r>
+          </w:p>
+        </w:tc>
+        <w:tc>
+          <w:tcPr>
+            <w:tcW w:type="dxa" w:w="3175"/>
+            <w:vAlign w:val="center"/>
+          </w:tcPr>
+          <w:p>
+            <w:pPr>
+              <w:jc w:val="left"/>
+            </w:pPr>
+            <w:r/>
+            <w:r>
+              <w:rPr>
+                <w:b w:val="0"/>
+                <w:sz w:val="17"/>
+              </w:rPr>
+              <w:t>Resolver valores ? y estandarizar Sí/No.</w:t>
+            </w:r>
+          </w:p>
+        </w:tc>
+        <w:tc>
+          <w:tcPr>
+            <w:tcW w:type="dxa" w:w="3175"/>
+            <w:vAlign w:val="center"/>
+          </w:tcPr>
+          <w:p>
+            <w:pPr>
+              <w:jc w:val="left"/>
+            </w:pPr>
+            <w:r/>
+            <w:r>
+              <w:rPr>
+                <w:b w:val="0"/>
+                <w:sz w:val="17"/>
+              </w:rPr>
+              <w:t>Permitirá valorar con más precisión la necesidad posterior de cirugía ortognática.</w:t>
+            </w:r>
+          </w:p>
+        </w:tc>
+      </w:tr>
+      <w:tr>
+        <w:tc>
+          <w:tcPr>
+            <w:tcW w:type="dxa" w:w="2721"/>
+            <w:vAlign w:val="center"/>
+          </w:tcPr>
+          <w:p>
+            <w:pPr>
+              <w:jc w:val="left"/>
+            </w:pPr>
+            <w:r/>
+            <w:r>
+              <w:rPr>
+                <w:b w:val="0"/>
+                <w:sz w:val="17"/>
+              </w:rPr>
+              <w:t>Seguimiento</w:t>
+            </w:r>
+          </w:p>
+        </w:tc>
+        <w:tc>
+          <w:tcPr>
+            <w:tcW w:type="dxa" w:w="3175"/>
+            <w:vAlign w:val="center"/>
+          </w:tcPr>
+          <w:p>
+            <w:pPr>
+              <w:jc w:val="left"/>
+            </w:pPr>
+            <w:r/>
+            <w:r>
+              <w:rPr>
+                <w:b w:val="0"/>
+                <w:sz w:val="17"/>
+              </w:rPr>
+              <w:t>Añadir si es posible fecha de cirugía, fecha de última revisión y meses de seguimiento.</w:t>
+            </w:r>
+          </w:p>
+        </w:tc>
+        <w:tc>
+          <w:tcPr>
+            <w:tcW w:type="dxa" w:w="3175"/>
+            <w:vAlign w:val="center"/>
+          </w:tcPr>
+          <w:p>
+            <w:pPr>
+              <w:jc w:val="left"/>
+            </w:pPr>
+            <w:r/>
+            <w:r>
+              <w:rPr>
+                <w:b w:val="0"/>
+                <w:sz w:val="17"/>
+              </w:rPr>
+              <w:t>Aportará contexto temporal a recidiva, resultado funcional y complicaciones tardías.</w:t>
+            </w:r>
+          </w:p>
+        </w:tc>
+      </w:tr>
+    </w:tbl>
+    <w:p/>
+    <w:p>
+      <w:r>
+        <w:rPr>
+          <w:b/>
+        </w:rPr>
+        <w:t>En sencillo:</w:t>
+      </w:r>
+      <w:r>
+        <w:t xml:space="preserve"> si el servicio corrige especialmente recidiva, tiempo de recidiva, oclusión y complicaciones, el análisis ganará valor porque podrá responder preguntas clínicas que ahora solo pueden dejarse como pendientes.</w:t>
       </w:r>
     </w:p>
     <w:p>

</xml_diff>